<commit_message>
i am back, girls
</commit_message>
<xml_diff>
--- a/Введение в ИТ/Реферат IP телефония.docx
+++ b/Введение в ИТ/Реферат IP телефония.docx
@@ -455,39 +455,7 @@
         <w:br/>
         <w:t>1.2. Исторический контекст: от PSTN к пакетной коммутации</w:t>
         <w:br/>
-        <w:t xml:space="preserve">1.3. </w:t>
-      </w:r>
-      <w:r>
-        <w:rPr>
-          <w:sz w:val="28"/>
-          <w:szCs w:val="28"/>
-          <w:lang w:val="mul" w:eastAsia="ru-RU"/>
-        </w:rPr>
-        <w:t>К</w:t>
-      </w:r>
-      <w:r>
-        <w:rPr>
-          <w:sz w:val="28"/>
-          <w:szCs w:val="28"/>
-          <w:lang w:val="mul" w:eastAsia="ru-RU"/>
-        </w:rPr>
-        <w:t xml:space="preserve">оммутация каналов </w:t>
-      </w:r>
-      <w:r>
-        <w:rPr>
-          <w:sz w:val="28"/>
-          <w:szCs w:val="28"/>
-          <w:lang w:val="mul" w:eastAsia="ru-RU"/>
-        </w:rPr>
-        <w:t>и</w:t>
-      </w:r>
-      <w:r>
-        <w:rPr>
-          <w:sz w:val="28"/>
-          <w:szCs w:val="28"/>
-          <w:lang w:val="mul" w:eastAsia="ru-RU"/>
-        </w:rPr>
-        <w:t xml:space="preserve"> коммутация пакетов</w:t>
+        <w:t>1.3. Коммутация каналов и коммутация пакетов</w:t>
       </w:r>
     </w:p>
     <w:p>
@@ -630,15 +598,7 @@
         <w:br/>
         <w:t>5.2. Проблемы QoS: задержка, джиттер, потери пакетов</w:t>
         <w:br/>
-        <w:t xml:space="preserve">5.3. </w:t>
-      </w:r>
-      <w:r>
-        <w:rPr>
-          <w:sz w:val="28"/>
-          <w:szCs w:val="28"/>
-          <w:lang w:val="mul" w:eastAsia="ru-RU"/>
-        </w:rPr>
-        <w:t>Безопасность</w:t>
+        <w:t>5.3. Безопасность</w:t>
       </w:r>
     </w:p>
     <w:p>
@@ -730,6 +690,7 @@
     <w:p>
       <w:pPr>
         <w:pStyle w:val="BodyText"/>
+        <w:spacing w:before="0" w:after="140"/>
         <w:rPr/>
       </w:pPr>
       <w:r>
@@ -757,23 +718,7 @@
           <w:szCs w:val="28"/>
           <w:lang w:val="mul"/>
         </w:rPr>
-        <w:t>В современном мире, где цифровые технологии пронизывают все сферы жизни, способы нашего общения также претерпели революционные изменения. Всего пару десятилетий назад основой голосовой связи была традиционная телефонная сеть общего пользования (Т</w:t>
-      </w:r>
-      <w:r>
-        <w:rPr>
-          <w:sz w:val="28"/>
-          <w:szCs w:val="28"/>
-          <w:lang w:val="mul"/>
-        </w:rPr>
-        <w:t>С</w:t>
-      </w:r>
-      <w:r>
-        <w:rPr>
-          <w:sz w:val="28"/>
-          <w:szCs w:val="28"/>
-          <w:lang w:val="mul"/>
-        </w:rPr>
-        <w:t>ОП или PSTN), работающая по принципу коммутации каналов и требовавшая развертывания сложной и дорогой физической инфраструктуры.</w:t>
+        <w:t>В современном мире, где цифровые технологии пронизывают все сферы жизни, способы нашего общения также претерпели революционные изменения. Всего пару десятилетий назад основой голосовой связи была традиционная телефонная сеть общего пользования (ТСОП или PSTN), работающая по принципу коммутации каналов и требовавшая развертывания сложной и дорогой физической инфраструктуры.</w:t>
       </w:r>
     </w:p>
     <w:p>
@@ -809,7 +754,7 @@
     </w:p>
     <w:p>
       <w:pPr>
-        <w:pStyle w:val="Style19"/>
+        <w:pStyle w:val="user6"/>
         <w:rPr>
           <w:sz w:val="28"/>
           <w:szCs w:val="28"/>
@@ -943,23 +888,7 @@
           <w:szCs w:val="28"/>
           <w:lang w:val="mul"/>
         </w:rPr>
-        <w:t>: Первые эксперименты в 70-х, коммерциализация в середине 90-х (программа VocalTec Internet Phone). Стимул — деш</w:t>
-      </w:r>
-      <w:r>
-        <w:rPr>
-          <w:sz w:val="28"/>
-          <w:szCs w:val="28"/>
-          <w:lang w:val="mul"/>
-        </w:rPr>
-        <w:t>ё</w:t>
-      </w:r>
-      <w:r>
-        <w:rPr>
-          <w:sz w:val="28"/>
-          <w:szCs w:val="28"/>
-          <w:lang w:val="mul"/>
-        </w:rPr>
-        <w:t>вый трафик Интернет.</w:t>
+        <w:t>: Первые эксперименты в 70-х, коммерциализация в середине 90-х (программа VocalTec Internet Phone). Стимул — дешёвый трафик Интернет.</w:t>
       </w:r>
     </w:p>
     <w:p>
@@ -1000,52 +929,17 @@
     <w:p>
       <w:pPr>
         <w:pStyle w:val="BodyText"/>
-        <w:rPr/>
-      </w:pPr>
-      <w:r>
-        <w:rPr>
-          <w:rStyle w:val="Strong"/>
-          <w:sz w:val="28"/>
-          <w:szCs w:val="28"/>
-          <w:lang w:val="mul"/>
-        </w:rPr>
-        <w:t xml:space="preserve">1.3. </w:t>
-      </w:r>
-      <w:r>
-        <w:rPr>
-          <w:rStyle w:val="Strong"/>
-          <w:sz w:val="28"/>
-          <w:szCs w:val="28"/>
-          <w:lang w:val="mul"/>
-        </w:rPr>
-        <w:t>К</w:t>
-      </w:r>
-      <w:r>
-        <w:rPr>
-          <w:rStyle w:val="Strong"/>
-          <w:sz w:val="28"/>
-          <w:szCs w:val="28"/>
-          <w:lang w:val="mul"/>
-        </w:rPr>
-        <w:t xml:space="preserve">оммутация каналов </w:t>
-      </w:r>
-      <w:r>
-        <w:rPr>
-          <w:rStyle w:val="Strong"/>
-          <w:sz w:val="28"/>
-          <w:szCs w:val="28"/>
-          <w:lang w:val="mul"/>
-        </w:rPr>
-        <w:t>и</w:t>
-      </w:r>
-      <w:r>
-        <w:rPr>
-          <w:rStyle w:val="Strong"/>
-          <w:sz w:val="28"/>
-          <w:szCs w:val="28"/>
-          <w:lang w:val="mul"/>
-        </w:rPr>
-        <w:t xml:space="preserve"> коммутация пакетов</w:t>
+        <w:spacing w:before="0" w:after="140"/>
+        <w:rPr/>
+      </w:pPr>
+      <w:r>
+        <w:rPr>
+          <w:rStyle w:val="Strong"/>
+          <w:sz w:val="28"/>
+          <w:szCs w:val="28"/>
+          <w:lang w:val="mul"/>
+        </w:rPr>
+        <w:t>1.3. Коммутация каналов и коммутация пакетов</w:t>
       </w:r>
     </w:p>
     <w:p>
@@ -1069,16 +963,7 @@
           <w:szCs w:val="28"/>
           <w:lang w:val="mul"/>
         </w:rPr>
-        <w:t>ТСОП</w:t>
-      </w:r>
-      <w:r>
-        <w:rPr>
-          <w:rStyle w:val="Strong"/>
-          <w:sz w:val="28"/>
-          <w:szCs w:val="28"/>
-          <w:lang w:val="mul"/>
-        </w:rPr>
-        <w:t xml:space="preserve"> (Коммутация каналов)</w:t>
+        <w:t>ТСОП (Коммутация каналов)</w:t>
       </w:r>
       <w:r>
         <w:rPr>
@@ -1180,14 +1065,98 @@
         </w:rPr>
         <w:t>2. АРХИТЕКТУРА И КОМПОНЕНТЫ</w:t>
       </w:r>
-      <w:r>
-        <w:rPr>
-          <w:sz w:val="28"/>
-          <w:szCs w:val="28"/>
-          <w:lang w:val="mul"/>
-        </w:rPr>
-        <w:br/>
-      </w:r>
+    </w:p>
+    <w:p>
+      <w:pPr>
+        <w:pStyle w:val="BodyText"/>
+        <w:rPr/>
+      </w:pPr>
+      <w:r>
+        <w:rPr>
+          <w:rStyle w:val="Strong"/>
+          <w:sz w:val="28"/>
+          <w:szCs w:val="28"/>
+          <w:lang w:val="mul"/>
+        </w:rPr>
+        <w:drawing>
+          <wp:inline distT="0" distB="0" distL="0" distR="0">
+            <wp:extent cx="6120130" cy="4261485"/>
+            <wp:effectExtent l="0" t="0" r="0" b="0"/>
+            <wp:docPr id="1" name="Изображение1"/>
+            <wp:cNvGraphicFramePr>
+              <a:graphicFrameLocks xmlns:a="http://schemas.openxmlformats.org/drawingml/2006/main" noChangeAspect="1"/>
+            </wp:cNvGraphicFramePr>
+            <a:graphic xmlns:a="http://schemas.openxmlformats.org/drawingml/2006/main">
+              <a:graphicData uri="http://schemas.openxmlformats.org/drawingml/2006/picture">
+                <pic:pic xmlns:pic="http://schemas.openxmlformats.org/drawingml/2006/picture">
+                  <pic:nvPicPr>
+                    <pic:cNvPr id="1" name="Изображение1"/>
+                    <pic:cNvPicPr>
+                      <a:picLocks noChangeAspect="1" noChangeArrowheads="1"/>
+                    </pic:cNvPicPr>
+                  </pic:nvPicPr>
+                  <pic:blipFill>
+                    <a:blip r:embed="rId2"/>
+                    <a:stretch>
+                      <a:fillRect/>
+                    </a:stretch>
+                  </pic:blipFill>
+                  <pic:spPr bwMode="auto">
+                    <a:xfrm>
+                      <a:off x="0" y="0"/>
+                      <a:ext cx="6120130" cy="4261485"/>
+                    </a:xfrm>
+                    <a:prstGeom prst="rect">
+                      <a:avLst/>
+                    </a:prstGeom>
+                    <a:noFill/>
+                  </pic:spPr>
+                </pic:pic>
+              </a:graphicData>
+            </a:graphic>
+          </wp:inline>
+        </w:drawing>
+      </w:r>
+    </w:p>
+    <w:p>
+      <w:pPr>
+        <w:pStyle w:val="BodyText"/>
+        <w:jc w:val="center"/>
+        <w:rPr/>
+      </w:pPr>
+      <w:r>
+        <w:rPr>
+          <w:rStyle w:val="Strong"/>
+          <w:sz w:val="28"/>
+          <w:szCs w:val="28"/>
+          <w:lang w:val="ru-RU"/>
+        </w:rPr>
+        <w:t xml:space="preserve">Схема </w:t>
+      </w:r>
+      <w:r>
+        <w:rPr>
+          <w:rStyle w:val="Strong"/>
+          <w:sz w:val="28"/>
+          <w:szCs w:val="28"/>
+          <w:lang w:val="en-US"/>
+        </w:rPr>
+        <w:t xml:space="preserve">Voice Over IP </w:t>
+      </w:r>
+      <w:r>
+        <w:rPr>
+          <w:rStyle w:val="Strong"/>
+          <w:sz w:val="28"/>
+          <w:szCs w:val="28"/>
+          <w:lang w:val="ru-RU"/>
+        </w:rPr>
+        <w:t>телефонии</w:t>
+      </w:r>
+    </w:p>
+    <w:p>
+      <w:pPr>
+        <w:pStyle w:val="BodyText"/>
+        <w:rPr/>
+      </w:pPr>
       <w:r>
         <w:rPr>
           <w:rStyle w:val="Strong"/>
@@ -1259,63 +1228,7 @@
           <w:szCs w:val="28"/>
           <w:lang w:val="mul"/>
         </w:rPr>
-        <w:t>: Приложени</w:t>
-      </w:r>
-      <w:r>
-        <w:rPr>
-          <w:sz w:val="28"/>
-          <w:szCs w:val="28"/>
-          <w:lang w:val="mul"/>
-        </w:rPr>
-        <w:t>я</w:t>
-      </w:r>
-      <w:r>
-        <w:rPr>
-          <w:sz w:val="28"/>
-          <w:szCs w:val="28"/>
-          <w:lang w:val="mul"/>
-        </w:rPr>
-        <w:t xml:space="preserve"> на ПК </w:t>
-      </w:r>
-      <w:r>
-        <w:rPr>
-          <w:sz w:val="28"/>
-          <w:szCs w:val="28"/>
-          <w:lang w:val="mul"/>
-        </w:rPr>
-        <w:t xml:space="preserve">или </w:t>
-      </w:r>
-      <w:r>
-        <w:rPr>
-          <w:sz w:val="28"/>
-          <w:szCs w:val="28"/>
-          <w:lang w:val="mul"/>
-        </w:rPr>
-        <w:t xml:space="preserve">смартфоне (например, Zoiper </w:t>
-      </w:r>
-      <w:r>
-        <w:rPr>
-          <w:sz w:val="28"/>
-          <w:szCs w:val="28"/>
-          <w:lang w:val="mul"/>
-        </w:rPr>
-        <w:t>или</w:t>
-      </w:r>
-      <w:r>
-        <w:rPr>
-          <w:sz w:val="28"/>
-          <w:szCs w:val="28"/>
-          <w:lang w:val="mul"/>
-        </w:rPr>
-        <w:t xml:space="preserve"> MicroSIP). Используют </w:t>
-      </w:r>
-      <w:r>
-        <w:rPr>
-          <w:sz w:val="28"/>
-          <w:szCs w:val="28"/>
-          <w:lang w:val="mul"/>
-        </w:rPr>
-        <w:t>средства ввода-вывода устройства.</w:t>
+        <w:t>: Приложения на ПК или смартфоне (например, Zoiper или MicroSIP). Используют средства ввода-вывода устройства.</w:t>
       </w:r>
     </w:p>
     <w:p>
@@ -1429,23 +1342,7 @@
           <w:szCs w:val="28"/>
           <w:lang w:val="ru-RU"/>
         </w:rPr>
-        <w:t xml:space="preserve"> </w:t>
-      </w:r>
-      <w:r>
-        <w:rPr>
-          <w:sz w:val="28"/>
-          <w:szCs w:val="28"/>
-          <w:lang w:val="ru-RU"/>
-        </w:rPr>
-        <w:t>и</w:t>
-      </w:r>
-      <w:r>
-        <w:rPr>
-          <w:sz w:val="28"/>
-          <w:szCs w:val="28"/>
-          <w:lang w:val="ru-RU"/>
-        </w:rPr>
-        <w:t xml:space="preserve"> </w:t>
+        <w:t xml:space="preserve"> и </w:t>
       </w:r>
       <w:r>
         <w:rPr>
@@ -1556,23 +1453,7 @@
           <w:szCs w:val="28"/>
           <w:lang w:val="ru-RU"/>
         </w:rPr>
-        <w:t>Т</w:t>
-      </w:r>
-      <w:r>
-        <w:rPr>
-          <w:sz w:val="28"/>
-          <w:szCs w:val="28"/>
-          <w:lang w:val="ru-RU"/>
-        </w:rPr>
-        <w:t>С</w:t>
-      </w:r>
-      <w:r>
-        <w:rPr>
-          <w:sz w:val="28"/>
-          <w:szCs w:val="28"/>
-          <w:lang w:val="ru-RU"/>
-        </w:rPr>
-        <w:t>ОП</w:t>
+        <w:t>ТСОП</w:t>
       </w:r>
       <w:r>
         <w:rPr>
@@ -2076,8 +1957,7 @@
       </w:r>
       <w:r>
         <w:rPr>
-          <w:rStyle w:val="Style15"/>
-          <w:rFonts w:ascii="Liberation Serif" w:hAnsi="Liberation Serif"/>
+          <w:rStyle w:val="user2"/>
           <w:sz w:val="28"/>
           <w:szCs w:val="28"/>
           <w:lang w:val="mul"/>
@@ -2478,39 +2358,7 @@
           <w:szCs w:val="28"/>
           <w:lang w:val="mul"/>
         </w:rPr>
-        <w:t xml:space="preserve">: </w:t>
-      </w:r>
-      <w:r>
-        <w:rPr>
-          <w:sz w:val="28"/>
-          <w:szCs w:val="28"/>
-          <w:lang w:val="mul"/>
-        </w:rPr>
-        <w:t>Д</w:t>
-      </w:r>
-      <w:r>
-        <w:rPr>
-          <w:sz w:val="28"/>
-          <w:szCs w:val="28"/>
-          <w:lang w:val="mul"/>
-        </w:rPr>
-        <w:t xml:space="preserve">ешёвые междугородние </w:t>
-      </w:r>
-      <w:r>
-        <w:rPr>
-          <w:sz w:val="28"/>
-          <w:szCs w:val="28"/>
-          <w:lang w:val="mul"/>
-        </w:rPr>
-        <w:t xml:space="preserve">и </w:t>
-      </w:r>
-      <w:r>
-        <w:rPr>
-          <w:sz w:val="28"/>
-          <w:szCs w:val="28"/>
-          <w:lang w:val="mul"/>
-        </w:rPr>
-        <w:t>международные звонки, консолидация сетей</w:t>
+        <w:t>: Дешёвые междугородние и международные звонки, консолидация сетей</w:t>
       </w:r>
     </w:p>
     <w:p>
@@ -2621,25 +2469,7 @@
           <w:szCs w:val="28"/>
           <w:lang w:val="mul"/>
         </w:rPr>
-        <w:t xml:space="preserve">5.2. Проблемы QoS </w:t>
-      </w:r>
-      <w:r>
-        <w:rPr>
-          <w:rStyle w:val="Strong"/>
-          <w:sz w:val="28"/>
-          <w:szCs w:val="28"/>
-          <w:lang w:val="mul"/>
-        </w:rPr>
-        <w:t>(</w:t>
-      </w:r>
-      <w:r>
-        <w:rPr>
-          <w:rStyle w:val="Strong"/>
-          <w:sz w:val="28"/>
-          <w:szCs w:val="28"/>
-          <w:lang w:val="mul"/>
-        </w:rPr>
-        <w:t>Quality of Service)</w:t>
+        <w:t>5.2. Проблемы QoS (Quality of Service)</w:t>
       </w:r>
     </w:p>
     <w:p>
@@ -2724,15 +2554,7 @@
           <w:szCs w:val="28"/>
           <w:lang w:val="mul"/>
         </w:rPr>
-        <w:t xml:space="preserve">. </w:t>
-      </w:r>
-      <w:r>
-        <w:rPr>
-          <w:sz w:val="28"/>
-          <w:szCs w:val="28"/>
-          <w:lang w:val="mul"/>
-        </w:rPr>
-        <w:t xml:space="preserve">Решение — </w:t>
+        <w:t xml:space="preserve">. Решение — </w:t>
       </w:r>
       <w:r>
         <w:rPr>
@@ -2750,15 +2572,7 @@
           <w:szCs w:val="28"/>
           <w:lang w:val="mul"/>
         </w:rPr>
-        <w:t xml:space="preserve"> </w:t>
-      </w:r>
-      <w:r>
-        <w:rPr>
-          <w:sz w:val="28"/>
-          <w:szCs w:val="28"/>
-          <w:lang w:val="mul"/>
-        </w:rPr>
-        <w:t>на при</w:t>
+        <w:t xml:space="preserve"> на при</w:t>
       </w:r>
       <w:r>
         <w:rPr>
@@ -2806,15 +2620,7 @@
           <w:szCs w:val="28"/>
           <w:lang w:val="mul"/>
         </w:rPr>
-        <w:t xml:space="preserve"> более </w:t>
-      </w:r>
-      <w:r>
-        <w:rPr>
-          <w:sz w:val="28"/>
-          <w:szCs w:val="28"/>
-          <w:lang w:val="mul"/>
-        </w:rPr>
-        <w:t>3% ухудшают разборчивость. Исправляются кодеком с коррекцией ошибок.</w:t>
+        <w:t xml:space="preserve"> более 3% ухудшают разборчивость. Исправляются кодеком с коррекцией ошибок.</w:t>
       </w:r>
     </w:p>
     <w:p>
@@ -2911,31 +2717,7 @@
           <w:szCs w:val="28"/>
           <w:lang w:val="mul"/>
         </w:rPr>
-        <w:t xml:space="preserve">: Перехват звонков (сниффинг), спам в IP-телефонии, атаки на отказ в обслуживании (DoS </w:t>
-      </w:r>
-      <w:r>
-        <w:rPr>
-          <w:sz w:val="28"/>
-          <w:szCs w:val="28"/>
-          <w:lang w:val="mul"/>
-        </w:rPr>
-        <w:t xml:space="preserve">и </w:t>
-      </w:r>
-      <w:r>
-        <w:rPr>
-          <w:sz w:val="28"/>
-          <w:szCs w:val="28"/>
-          <w:lang w:val="mul"/>
-        </w:rPr>
-        <w:t>D-DoS</w:t>
-      </w:r>
-      <w:r>
-        <w:rPr>
-          <w:sz w:val="28"/>
-          <w:szCs w:val="28"/>
-          <w:lang w:val="mul"/>
-        </w:rPr>
-        <w:t>).</w:t>
+        <w:t>: Перехват звонков (сниффинг), спам в IP-телефонии, атаки на отказ в обслуживании (DoS и D-DoS).</w:t>
       </w:r>
     </w:p>
     <w:p>
@@ -3116,7 +2898,7 @@
     </w:p>
     <w:p>
       <w:pPr>
-        <w:pStyle w:val="Style19"/>
+        <w:pStyle w:val="user6"/>
         <w:rPr>
           <w:sz w:val="28"/>
           <w:szCs w:val="28"/>
@@ -3332,6 +3114,7 @@
           <w:tab w:val="left" w:pos="0" w:leader="none"/>
         </w:tabs>
         <w:bidi w:val="0"/>
+        <w:spacing w:before="0" w:after="140"/>
         <w:ind w:hanging="0" w:left="0"/>
         <w:rPr>
           <w:sz w:val="28"/>
@@ -3451,7 +3234,7 @@
         </w:rPr>
         <w:t>Спецификация RFC 3261 – SIP: Session Initiation Protocol – IETF, 2002. – URL: </w:t>
       </w:r>
-      <w:hyperlink r:id="rId2" w:tgtFrame="_blank">
+      <w:hyperlink r:id="rId3" w:tgtFrame="_blank">
         <w:r>
           <w:rPr>
             <w:rStyle w:val="Hyperlink"/>
@@ -3485,7 +3268,7 @@
         </w:rPr>
         <w:t>Официальная документация проекта Asterisk – URL: </w:t>
       </w:r>
-      <w:hyperlink r:id="rId3" w:tgtFrame="_blank">
+      <w:hyperlink r:id="rId4" w:tgtFrame="_blank">
         <w:r>
           <w:rPr>
             <w:rStyle w:val="Hyperlink"/>
@@ -3519,7 +3302,7 @@
         </w:rPr>
         <w:t>Cisco. Руководство по основам IP-телефонии – URL: </w:t>
       </w:r>
-      <w:hyperlink r:id="rId4" w:tgtFrame="_blank">
+      <w:hyperlink r:id="rId5" w:tgtFrame="_blank">
         <w:r>
           <w:rPr>
             <w:rStyle w:val="Hyperlink"/>
@@ -3553,7 +3336,7 @@
         </w:rPr>
         <w:t>Электронный журнал «Connect! Мир связи» – Разделы, посвященные IP-телефонии и УК. – URL: </w:t>
       </w:r>
-      <w:hyperlink r:id="rId5" w:tgtFrame="_blank">
+      <w:hyperlink r:id="rId6" w:tgtFrame="_blank">
         <w:r>
           <w:rPr>
             <w:rStyle w:val="Hyperlink"/>
@@ -3587,7 +3370,7 @@
         </w:rPr>
         <w:t>Хабр. Статьи по тегам VoIP, IP-телефония, SIP – URL: </w:t>
       </w:r>
-      <w:hyperlink r:id="rId6" w:tgtFrame="_blank">
+      <w:hyperlink r:id="rId7" w:tgtFrame="_blank">
         <w:r>
           <w:rPr>
             <w:rStyle w:val="Hyperlink"/>
@@ -3619,9 +3402,9 @@
       </w:r>
     </w:p>
     <w:sectPr>
-      <w:footerReference w:type="even" r:id="rId7"/>
-      <w:footerReference w:type="default" r:id="rId8"/>
-      <w:footerReference w:type="first" r:id="rId9"/>
+      <w:footerReference w:type="even" r:id="rId8"/>
+      <w:footerReference w:type="default" r:id="rId9"/>
+      <w:footerReference w:type="first" r:id="rId10"/>
       <w:type w:val="nextPage"/>
       <w:pgSz w:w="11906" w:h="16838"/>
       <w:pgMar w:left="1134" w:right="1134" w:gutter="0" w:header="0" w:top="1134" w:footer="1134" w:bottom="1693"/>
@@ -5930,7 +5713,7 @@
   </w:style>
   <w:style w:type="paragraph" w:styleId="Heading3">
     <w:name w:val="heading 3"/>
-    <w:basedOn w:val="user"/>
+    <w:basedOn w:val="Style13"/>
     <w:next w:val="BodyText"/>
     <w:qFormat/>
     <w:pPr>
@@ -5959,8 +5742,8 @@
       <w:bCs/>
     </w:rPr>
   </w:style>
-  <w:style w:type="character" w:styleId="Style13">
-    <w:name w:val="Символ нумерации"/>
+  <w:style w:type="character" w:styleId="user">
+    <w:name w:val="Символ нумерации (user)"/>
     <w:qFormat/>
     <w:rPr/>
   </w:style>
@@ -5971,21 +5754,21 @@
       <w:u w:val="single"/>
     </w:rPr>
   </w:style>
-  <w:style w:type="character" w:styleId="Style14">
-    <w:name w:val="Маркеры"/>
+  <w:style w:type="character" w:styleId="user1">
+    <w:name w:val="Маркеры (user)"/>
     <w:qFormat/>
     <w:rPr>
       <w:rFonts w:ascii="OpenSymbol" w:hAnsi="OpenSymbol" w:eastAsia="OpenSymbol" w:cs="OpenSymbol"/>
     </w:rPr>
   </w:style>
-  <w:style w:type="character" w:styleId="Style15">
-    <w:name w:val="Исходный текст"/>
+  <w:style w:type="character" w:styleId="user2">
+    <w:name w:val="Исходный текст (user)"/>
     <w:qFormat/>
     <w:rPr>
       <w:rFonts w:ascii="Liberation Mono" w:hAnsi="Liberation Mono" w:eastAsia="NSimSun" w:cs="Liberation Mono"/>
     </w:rPr>
   </w:style>
-  <w:style w:type="paragraph" w:styleId="Style16">
+  <w:style w:type="paragraph" w:styleId="Style13">
     <w:name w:val="Заголовок"/>
     <w:basedOn w:val="Normal"/>
     <w:next w:val="BodyText"/>
@@ -6032,7 +5815,7 @@
       <w:szCs w:val="24"/>
     </w:rPr>
   </w:style>
-  <w:style w:type="paragraph" w:styleId="Style17">
+  <w:style w:type="paragraph" w:styleId="Style14">
     <w:name w:val="Указатель"/>
     <w:basedOn w:val="Normal"/>
     <w:qFormat/>
@@ -6043,7 +5826,7 @@
       <w:rFonts w:cs="Lucida Sans"/>
     </w:rPr>
   </w:style>
-  <w:style w:type="paragraph" w:styleId="user">
+  <w:style w:type="paragraph" w:styleId="user3">
     <w:name w:val="Заголовок (user)"/>
     <w:basedOn w:val="Normal"/>
     <w:next w:val="BodyText"/>
@@ -6058,7 +5841,7 @@
       <w:szCs w:val="28"/>
     </w:rPr>
   </w:style>
-  <w:style w:type="paragraph" w:styleId="user1">
+  <w:style w:type="paragraph" w:styleId="user4">
     <w:name w:val="Указатель (user)"/>
     <w:basedOn w:val="Normal"/>
     <w:qFormat/>
@@ -6069,8 +5852,8 @@
       <w:rFonts w:cs="Lucida Sans"/>
     </w:rPr>
   </w:style>
-  <w:style w:type="paragraph" w:styleId="user2">
-    <w:name w:val="Колонтитулы (user)"/>
+  <w:style w:type="paragraph" w:styleId="Style15">
+    <w:name w:val="Колонтитулы"/>
     <w:basedOn w:val="Normal"/>
     <w:qFormat/>
     <w:pPr>
@@ -6083,8 +5866,8 @@
     </w:pPr>
     <w:rPr/>
   </w:style>
-  <w:style w:type="paragraph" w:styleId="Style18">
-    <w:name w:val="Колонтитулы"/>
+  <w:style w:type="paragraph" w:styleId="user5">
+    <w:name w:val="Колонтитулы (user)"/>
     <w:basedOn w:val="Normal"/>
     <w:qFormat/>
     <w:pPr/>
@@ -6092,7 +5875,7 @@
   </w:style>
   <w:style w:type="paragraph" w:styleId="Footer">
     <w:name w:val="footer"/>
-    <w:basedOn w:val="user2"/>
+    <w:basedOn w:val="Style15"/>
     <w:pPr>
       <w:suppressLineNumbers/>
     </w:pPr>
@@ -6100,14 +5883,14 @@
   </w:style>
   <w:style w:type="paragraph" w:styleId="Header">
     <w:name w:val="header"/>
-    <w:basedOn w:val="user2"/>
+    <w:basedOn w:val="Style15"/>
     <w:pPr>
       <w:suppressLineNumbers/>
     </w:pPr>
     <w:rPr/>
   </w:style>
-  <w:style w:type="paragraph" w:styleId="user3">
-    <w:name w:val="Верхний колонтитул слева (user)"/>
+  <w:style w:type="paragraph" w:styleId="Style16">
+    <w:name w:val="Верхний колонтитул слева"/>
     <w:basedOn w:val="Header"/>
     <w:qFormat/>
     <w:pPr>
@@ -6115,8 +5898,8 @@
     </w:pPr>
     <w:rPr/>
   </w:style>
-  <w:style w:type="paragraph" w:styleId="Style19">
-    <w:name w:val="Горизонтальная линия"/>
+  <w:style w:type="paragraph" w:styleId="user6">
+    <w:name w:val="Горизонтальная линия (user)"/>
     <w:basedOn w:val="Normal"/>
     <w:next w:val="BodyText"/>
     <w:qFormat/>

</xml_diff>